<commit_message>
Sales overview: add Mailboxes & Routing, Recipients, Print Queue sections + multi-file portal; regenerate PDF/DOCX (10 sections)
Co-Authored-By: Claude Opus 4.8 <noreply@anthropic.com>
</commit_message>
<xml_diff>
--- a/Sales/Mail-IQ_Product_Overview.docx
+++ b/Sales/Mail-IQ_Product_Overview.docx
@@ -394,7 +394,7 @@
           <w:bCs/>
           <w:color w:val="1A1440"/>
         </w:rPr>
-        <w:t xml:space="preserve">Inbound — filing rules</w:t>
+        <w:t xml:space="preserve">Inbound — mailboxes &amp; routing</w:t>
       </w:r>
     </w:p>
     <w:p>
@@ -405,7 +405,7 @@
         <w:rPr>
           <w:color w:val="3A3552"/>
         </w:rPr>
-        <w:t xml:space="preserve">The real time-saver. A filing rule reads a reference off the document — a matter number, an invoice — and drops the correctly-named file into a watch folder your other systems already monitor. Case management and accounts payable, fed automatically.</w:t>
+        <w:t xml:space="preserve">Mailboxes are the internal destinations post is routed to: shared team boxes and private personal ones. Routing rules decide, by document type and keyword, which box each item lands in — and anything unmatched waits safely in triage rather than going astray.</w:t>
       </w:r>
     </w:p>
     <w:p>
@@ -438,61 +438,61 @@
           <w:bCs/>
           <w:color w:val="1A1440"/>
         </w:rPr>
-        <w:t xml:space="preserve">Named by reference.  </w:t>
-      </w:r>
-      <w:r>
-        <w:rPr>
-          <w:color w:val="3A3552"/>
-        </w:rPr>
-        <w:t xml:space="preserve">Mail-IQ finds the matter reference on a legal letter and files it as, say, BRN-2024-0142.pdf — ready for Proclaim to ingest.</w:t>
-      </w:r>
-    </w:p>
-    <w:p>
-      <w:pPr>
-        <w:pStyle w:val="ListParagraph"/>
-        <w:numPr>
-          <w:ilvl w:val="0"/>
-          <w:numId w:val="2"/>
-        </w:numPr>
-        <w:spacing w:after="90"/>
-      </w:pPr>
-      <w:r>
-        <w:rPr>
-          <w:b/>
-          <w:bCs/>
-          <w:color w:val="1A1440"/>
-        </w:rPr>
-        <w:t xml:space="preserve">Forward mode.  </w:t>
-      </w:r>
-      <w:r>
-        <w:rPr>
-          <w:color w:val="3A3552"/>
-        </w:rPr>
-        <w:t xml:space="preserve">Invoices need no reference — leave the format blank and they’re forwarded straight to an Invoice-IQ hot folder for automated AP.</w:t>
-      </w:r>
-    </w:p>
-    <w:p>
-      <w:pPr>
-        <w:pStyle w:val="ListParagraph"/>
-        <w:numPr>
-          <w:ilvl w:val="0"/>
-          <w:numId w:val="2"/>
-        </w:numPr>
-        <w:spacing w:after="90"/>
-      </w:pPr>
-      <w:r>
-        <w:rPr>
-          <w:b/>
-          <w:bCs/>
-          <w:color w:val="1A1440"/>
-        </w:rPr>
-        <w:t xml:space="preserve">Per-client formats.  </w:t>
-      </w:r>
-      <w:r>
-        <w:rPr>
-          <w:color w:val="3A3552"/>
-        </w:rPr>
-        <w:t xml:space="preserve">Each client’s reference pattern is typed once as a simple mask (# = a digit); the agent writes the file into whichever watch folder you map on that PC.</w:t>
+        <w:t xml:space="preserve">Team boxes.  </w:t>
+      </w:r>
+      <w:r>
+        <w:rPr>
+          <w:color w:val="3A3552"/>
+        </w:rPr>
+        <w:t xml:space="preserve">Shared inboxes for Legal, Accounts and so on; everyone in the team sees the post, and an administrator can too.</w:t>
+      </w:r>
+    </w:p>
+    <w:p>
+      <w:pPr>
+        <w:pStyle w:val="ListParagraph"/>
+        <w:numPr>
+          <w:ilvl w:val="0"/>
+          <w:numId w:val="2"/>
+        </w:numPr>
+        <w:spacing w:after="90"/>
+      </w:pPr>
+      <w:r>
+        <w:rPr>
+          <w:b/>
+          <w:bCs/>
+          <w:color w:val="1A1440"/>
+        </w:rPr>
+        <w:t xml:space="preserve">Personal &amp; private.  </w:t>
+      </w:r>
+      <w:r>
+        <w:rPr>
+          <w:color w:val="3A3552"/>
+        </w:rPr>
+        <w:t xml:space="preserve">Everyone gets a personal inbox that only they can read — an administrator can see it exists, but never its contents.</w:t>
+      </w:r>
+    </w:p>
+    <w:p>
+      <w:pPr>
+        <w:pStyle w:val="ListParagraph"/>
+        <w:numPr>
+          <w:ilvl w:val="0"/>
+          <w:numId w:val="2"/>
+        </w:numPr>
+        <w:spacing w:after="90"/>
+      </w:pPr>
+      <w:r>
+        <w:rPr>
+          <w:b/>
+          <w:bCs/>
+          <w:color w:val="1A1440"/>
+        </w:rPr>
+        <w:t xml:space="preserve">Routing rules &amp; triage.  </w:t>
+      </w:r>
+      <w:r>
+        <w:rPr>
+          <w:color w:val="3A3552"/>
+        </w:rPr>
+        <w:t xml:space="preserve">Rules match on document type and keyword (highest priority wins) to pick a box; anything unrecognised parks in the triage queue so nothing is ever lost.</w:t>
       </w:r>
     </w:p>
     <w:p>
@@ -514,7 +514,7 @@
           <w:bCs/>
           <w:color w:val="1A1440"/>
         </w:rPr>
-        <w:t xml:space="preserve">Outbound — campaigns</w:t>
+        <w:t xml:space="preserve">Inbound — filing rules</w:t>
       </w:r>
     </w:p>
     <w:p>
@@ -525,7 +525,7 @@
         <w:rPr>
           <w:color w:val="3A3552"/>
         </w:rPr>
-        <w:t xml:space="preserve">Upload a ready-made letter, or compose one with merge fields. Mail-IQ produces an individually-addressed copy for each recipient, attaches any enclosures, stamps a unique QR, and sends each one the way that person prefers — post, email or SMS.</w:t>
+        <w:t xml:space="preserve">The real time-saver. A filing rule reads a reference off the document — a matter number, an invoice — and drops the correctly-named file into a watch folder your other systems already monitor. Case management and accounts payable, fed automatically.</w:t>
       </w:r>
     </w:p>
     <w:p>
@@ -558,61 +558,61 @@
           <w:bCs/>
           <w:color w:val="1A1440"/>
         </w:rPr>
-        <w:t xml:space="preserve">Upload or compose.  </w:t>
-      </w:r>
-      <w:r>
-        <w:rPr>
-          <w:color w:val="3A3552"/>
-        </w:rPr>
-        <w:t xml:space="preserve">Bring a finished PDF (address &amp; QR are overlaid), or type a letter with {firstName}, {account}, {postcode} tokens and Mail-IQ personalises the body for every recipient.</w:t>
-      </w:r>
-    </w:p>
-    <w:p>
-      <w:pPr>
-        <w:pStyle w:val="ListParagraph"/>
-        <w:numPr>
-          <w:ilvl w:val="0"/>
-          <w:numId w:val="2"/>
-        </w:numPr>
-        <w:spacing w:after="90"/>
-      </w:pPr>
-      <w:r>
-        <w:rPr>
-          <w:b/>
-          <w:bCs/>
-          <w:color w:val="1A1440"/>
-        </w:rPr>
-        <w:t xml:space="preserve">Unique QR per copy.  </w:t>
-      </w:r>
-      <w:r>
-        <w:rPr>
-          <w:color w:val="3A3552"/>
-        </w:rPr>
-        <w:t xml:space="preserve">Each letter carries its own QR — an opaque code, no personal data printed — so a returned document can be matched back to that exact recipient.</w:t>
-      </w:r>
-    </w:p>
-    <w:p>
-      <w:pPr>
-        <w:pStyle w:val="ListParagraph"/>
-        <w:numPr>
-          <w:ilvl w:val="0"/>
-          <w:numId w:val="2"/>
-        </w:numPr>
-        <w:spacing w:after="90"/>
-      </w:pPr>
-      <w:r>
-        <w:rPr>
-          <w:b/>
-          <w:bCs/>
-          <w:color w:val="1A1440"/>
-        </w:rPr>
-        <w:t xml:space="preserve">Routed by preference.  </w:t>
-      </w:r>
-      <w:r>
-        <w:rPr>
-          <w:color w:val="3A3552"/>
-        </w:rPr>
-        <w:t xml:space="preserve">Post, email or SMS is chosen from each recipient’s record — one action, three channels, and a count of each before you send.</w:t>
+        <w:t xml:space="preserve">Named by reference.  </w:t>
+      </w:r>
+      <w:r>
+        <w:rPr>
+          <w:color w:val="3A3552"/>
+        </w:rPr>
+        <w:t xml:space="preserve">Mail-IQ finds the matter reference on a legal letter and files it as, say, BRN-2024-0142.pdf — ready for Proclaim to ingest.</w:t>
+      </w:r>
+    </w:p>
+    <w:p>
+      <w:pPr>
+        <w:pStyle w:val="ListParagraph"/>
+        <w:numPr>
+          <w:ilvl w:val="0"/>
+          <w:numId w:val="2"/>
+        </w:numPr>
+        <w:spacing w:after="90"/>
+      </w:pPr>
+      <w:r>
+        <w:rPr>
+          <w:b/>
+          <w:bCs/>
+          <w:color w:val="1A1440"/>
+        </w:rPr>
+        <w:t xml:space="preserve">Forward mode.  </w:t>
+      </w:r>
+      <w:r>
+        <w:rPr>
+          <w:color w:val="3A3552"/>
+        </w:rPr>
+        <w:t xml:space="preserve">Invoices need no reference — leave the format blank and they’re forwarded straight to an Invoice-IQ hot folder for automated AP.</w:t>
+      </w:r>
+    </w:p>
+    <w:p>
+      <w:pPr>
+        <w:pStyle w:val="ListParagraph"/>
+        <w:numPr>
+          <w:ilvl w:val="0"/>
+          <w:numId w:val="2"/>
+        </w:numPr>
+        <w:spacing w:after="90"/>
+      </w:pPr>
+      <w:r>
+        <w:rPr>
+          <w:b/>
+          <w:bCs/>
+          <w:color w:val="1A1440"/>
+        </w:rPr>
+        <w:t xml:space="preserve">Per-client formats.  </w:t>
+      </w:r>
+      <w:r>
+        <w:rPr>
+          <w:color w:val="3A3552"/>
+        </w:rPr>
+        <w:t xml:space="preserve">Each client’s reference pattern is typed once as a simple mask (# = a digit); the agent writes the file into whichever watch folder you map on that PC.</w:t>
       </w:r>
     </w:p>
     <w:p>
@@ -634,7 +634,7 @@
           <w:bCs/>
           <w:color w:val="1A1440"/>
         </w:rPr>
-        <w:t xml:space="preserve">Outbound — recipient portal</w:t>
+        <w:t xml:space="preserve">Outbound — recipients</w:t>
       </w:r>
     </w:p>
     <w:p>
@@ -645,7 +645,7 @@
         <w:rPr>
           <w:color w:val="3A3552"/>
         </w:rPr>
-        <w:t xml:space="preserve">Recipients reached by email or SMS get a link to their own secure page — like an insurer sending your policy documents to a portal. They view and download what you sent, and upload a completed response straight back.</w:t>
+        <w:t xml:space="preserve">Your audience lives here. Import a spreadsheet or add people by hand; each recipient carries their address, email, mobile and — the key field — a delivery preference. That preference is what routes every future mailing to post, email or SMS automatically.</w:t>
       </w:r>
     </w:p>
     <w:p>
@@ -678,61 +678,61 @@
           <w:bCs/>
           <w:color w:val="1A1440"/>
         </w:rPr>
-        <w:t xml:space="preserve">Secure, per-recipient link.  </w:t>
-      </w:r>
-      <w:r>
-        <w:rPr>
-          <w:color w:val="3A3552"/>
-        </w:rPr>
-        <w:t xml:space="preserve">A unique unguessable link — no login, no personal data in the address. It records when they opened and downloaded.</w:t>
-      </w:r>
-    </w:p>
-    <w:p>
-      <w:pPr>
-        <w:pStyle w:val="ListParagraph"/>
-        <w:numPr>
-          <w:ilvl w:val="0"/>
-          <w:numId w:val="2"/>
-        </w:numPr>
-        <w:spacing w:after="90"/>
-      </w:pPr>
-      <w:r>
-        <w:rPr>
-          <w:b/>
-          <w:bCs/>
-          <w:color w:val="1A1440"/>
-        </w:rPr>
-        <w:t xml:space="preserve">Upload back.  </w:t>
-      </w:r>
-      <w:r>
-        <w:rPr>
-          <w:color w:val="3A3552"/>
-        </w:rPr>
-        <w:t xml:space="preserve">The recipient returns a completed form digitally; it’s stored against their record and marks them as responded — no printing, no posting.</w:t>
-      </w:r>
-    </w:p>
-    <w:p>
-      <w:pPr>
-        <w:pStyle w:val="ListParagraph"/>
-        <w:numPr>
-          <w:ilvl w:val="0"/>
-          <w:numId w:val="2"/>
-        </w:numPr>
-        <w:spacing w:after="90"/>
-      </w:pPr>
-      <w:r>
-        <w:rPr>
-          <w:b/>
-          <w:bCs/>
-          <w:color w:val="1A1440"/>
-        </w:rPr>
-        <w:t xml:space="preserve">Sent by SMS or email.  </w:t>
-      </w:r>
-      <w:r>
-        <w:rPr>
-          <w:color w:val="3A3552"/>
-        </w:rPr>
-        <w:t xml:space="preserve">The same portal is reached from a texted link or an email button — whichever channel the recipient prefers.</w:t>
+        <w:t xml:space="preserve">Delivery preference per person.  </w:t>
+      </w:r>
+      <w:r>
+        <w:rPr>
+          <w:color w:val="3A3552"/>
+        </w:rPr>
+        <w:t xml:space="preserve">Post, email, SMS or auto (Mail-IQ picks the best available). Set it once and every campaign honours it — no sorting into piles.</w:t>
+      </w:r>
+    </w:p>
+    <w:p>
+      <w:pPr>
+        <w:pStyle w:val="ListParagraph"/>
+        <w:numPr>
+          <w:ilvl w:val="0"/>
+          <w:numId w:val="2"/>
+        </w:numPr>
+        <w:spacing w:after="90"/>
+      </w:pPr>
+      <w:r>
+        <w:rPr>
+          <w:b/>
+          <w:bCs/>
+          <w:color w:val="1A1440"/>
+        </w:rPr>
+        <w:t xml:space="preserve">Import in seconds.  </w:t>
+      </w:r>
+      <w:r>
+        <w:rPr>
+          <w:color w:val="3A3552"/>
+        </w:rPr>
+        <w:t xml:space="preserve">Upload a CSV of your customers or members; matching records update rather than duplicate, so re-imports stay clean.</w:t>
+      </w:r>
+    </w:p>
+    <w:p>
+      <w:pPr>
+        <w:pStyle w:val="ListParagraph"/>
+        <w:numPr>
+          <w:ilvl w:val="0"/>
+          <w:numId w:val="2"/>
+        </w:numPr>
+        <w:spacing w:after="90"/>
+      </w:pPr>
+      <w:r>
+        <w:rPr>
+          <w:b/>
+          <w:bCs/>
+          <w:color w:val="1A1440"/>
+        </w:rPr>
+        <w:t xml:space="preserve">Everything on one record.  </w:t>
+      </w:r>
+      <w:r>
+        <w:rPr>
+          <w:color w:val="3A3552"/>
+        </w:rPr>
+        <w:t xml:space="preserve">Address, account number, email and mobile live together — the address feeds the window envelope, the email and mobile feed the digital channels.</w:t>
       </w:r>
     </w:p>
     <w:p>
@@ -747,6 +747,366 @@
           <w:color w:val="7C3AED"/>
         </w:rPr>
         <w:t xml:space="preserve">06  </w:t>
+      </w:r>
+      <w:r>
+        <w:rPr>
+          <w:b/>
+          <w:bCs/>
+          <w:color w:val="1A1440"/>
+        </w:rPr>
+        <w:t xml:space="preserve">Outbound — campaigns</w:t>
+      </w:r>
+    </w:p>
+    <w:p>
+      <w:pPr>
+        <w:spacing w:after="130"/>
+      </w:pPr>
+      <w:r>
+        <w:rPr>
+          <w:color w:val="3A3552"/>
+        </w:rPr>
+        <w:t xml:space="preserve">Upload a ready-made letter, or compose one with merge fields. Mail-IQ produces an individually-addressed copy for each recipient, attaches any enclosures, stamps a unique QR, and sends each one the way that person prefers — post, email or SMS.</w:t>
+      </w:r>
+    </w:p>
+    <w:p>
+      <w:pPr>
+        <w:spacing w:after="90" w:before="180"/>
+      </w:pPr>
+      <w:r>
+        <w:rPr>
+          <w:b/>
+          <w:bCs/>
+          <w:color w:val="1A1440"/>
+          <w:sz w:val="24"/>
+          <w:szCs w:val="24"/>
+        </w:rPr>
+        <w:t xml:space="preserve">How it works</w:t>
+      </w:r>
+    </w:p>
+    <w:p>
+      <w:pPr>
+        <w:pStyle w:val="ListParagraph"/>
+        <w:numPr>
+          <w:ilvl w:val="0"/>
+          <w:numId w:val="2"/>
+        </w:numPr>
+        <w:spacing w:after="90"/>
+      </w:pPr>
+      <w:r>
+        <w:rPr>
+          <w:b/>
+          <w:bCs/>
+          <w:color w:val="1A1440"/>
+        </w:rPr>
+        <w:t xml:space="preserve">Upload or compose.  </w:t>
+      </w:r>
+      <w:r>
+        <w:rPr>
+          <w:color w:val="3A3552"/>
+        </w:rPr>
+        <w:t xml:space="preserve">Bring a finished PDF (address &amp; QR are overlaid), or type a letter with {firstName}, {account}, {postcode} tokens and Mail-IQ personalises the body for every recipient.</w:t>
+      </w:r>
+    </w:p>
+    <w:p>
+      <w:pPr>
+        <w:pStyle w:val="ListParagraph"/>
+        <w:numPr>
+          <w:ilvl w:val="0"/>
+          <w:numId w:val="2"/>
+        </w:numPr>
+        <w:spacing w:after="90"/>
+      </w:pPr>
+      <w:r>
+        <w:rPr>
+          <w:b/>
+          <w:bCs/>
+          <w:color w:val="1A1440"/>
+        </w:rPr>
+        <w:t xml:space="preserve">Unique QR per copy.  </w:t>
+      </w:r>
+      <w:r>
+        <w:rPr>
+          <w:color w:val="3A3552"/>
+        </w:rPr>
+        <w:t xml:space="preserve">Each letter carries its own QR — an opaque code, no personal data printed — so a returned document can be matched back to that exact recipient.</w:t>
+      </w:r>
+    </w:p>
+    <w:p>
+      <w:pPr>
+        <w:pStyle w:val="ListParagraph"/>
+        <w:numPr>
+          <w:ilvl w:val="0"/>
+          <w:numId w:val="2"/>
+        </w:numPr>
+        <w:spacing w:after="90"/>
+      </w:pPr>
+      <w:r>
+        <w:rPr>
+          <w:b/>
+          <w:bCs/>
+          <w:color w:val="1A1440"/>
+        </w:rPr>
+        <w:t xml:space="preserve">Routed by preference.  </w:t>
+      </w:r>
+      <w:r>
+        <w:rPr>
+          <w:color w:val="3A3552"/>
+        </w:rPr>
+        <w:t xml:space="preserve">Post, email or SMS is chosen from each recipient’s record — one action, three channels, and a count of each before you send.</w:t>
+      </w:r>
+    </w:p>
+    <w:p>
+      <w:pPr>
+        <w:pStyle w:val="Heading1"/>
+        <w:spacing w:after="130" w:before="320"/>
+      </w:pPr>
+      <w:r>
+        <w:rPr>
+          <w:b/>
+          <w:bCs/>
+          <w:color w:val="7C3AED"/>
+        </w:rPr>
+        <w:t xml:space="preserve">07  </w:t>
+      </w:r>
+      <w:r>
+        <w:rPr>
+          <w:b/>
+          <w:bCs/>
+          <w:color w:val="1A1440"/>
+        </w:rPr>
+        <w:t xml:space="preserve">Outbound — print queue</w:t>
+      </w:r>
+    </w:p>
+    <w:p>
+      <w:pPr>
+        <w:spacing w:after="130"/>
+      </w:pPr>
+      <w:r>
+        <w:rPr>
+          <w:color w:val="3A3552"/>
+        </w:rPr>
+        <w:t xml:space="preserve">The recipients set to post don’t need handling one by one. Mail-IQ collects them into a batch and generates a single print-ready PDF — each page already carrying the recipient’s address in the window position and its unique QR. Hand it to any printer or franking machine, then mark it printed and posted.</w:t>
+      </w:r>
+    </w:p>
+    <w:p>
+      <w:pPr>
+        <w:spacing w:after="90" w:before="180"/>
+      </w:pPr>
+      <w:r>
+        <w:rPr>
+          <w:b/>
+          <w:bCs/>
+          <w:color w:val="1A1440"/>
+          <w:sz w:val="24"/>
+          <w:szCs w:val="24"/>
+        </w:rPr>
+        <w:t xml:space="preserve">How it works</w:t>
+      </w:r>
+    </w:p>
+    <w:p>
+      <w:pPr>
+        <w:pStyle w:val="ListParagraph"/>
+        <w:numPr>
+          <w:ilvl w:val="0"/>
+          <w:numId w:val="2"/>
+        </w:numPr>
+        <w:spacing w:after="90"/>
+      </w:pPr>
+      <w:r>
+        <w:rPr>
+          <w:b/>
+          <w:bCs/>
+          <w:color w:val="1A1440"/>
+        </w:rPr>
+        <w:t xml:space="preserve">Batched automatically.  </w:t>
+      </w:r>
+      <w:r>
+        <w:rPr>
+          <w:color w:val="3A3552"/>
+        </w:rPr>
+        <w:t xml:space="preserve">Postal copies from your campaigns collect into a dated print run — no exporting or collating by hand.</w:t>
+      </w:r>
+    </w:p>
+    <w:p>
+      <w:pPr>
+        <w:pStyle w:val="ListParagraph"/>
+        <w:numPr>
+          <w:ilvl w:val="0"/>
+          <w:numId w:val="2"/>
+        </w:numPr>
+        <w:spacing w:after="90"/>
+      </w:pPr>
+      <w:r>
+        <w:rPr>
+          <w:b/>
+          <w:bCs/>
+          <w:color w:val="1A1440"/>
+        </w:rPr>
+        <w:t xml:space="preserve">One print-ready PDF.  </w:t>
+      </w:r>
+      <w:r>
+        <w:rPr>
+          <w:color w:val="3A3552"/>
+        </w:rPr>
+        <w:t xml:space="preserve">Generate the whole run as a single file; every page is addressed in the window position and carries its unique QR, ready for the printer.</w:t>
+      </w:r>
+    </w:p>
+    <w:p>
+      <w:pPr>
+        <w:pStyle w:val="ListParagraph"/>
+        <w:numPr>
+          <w:ilvl w:val="0"/>
+          <w:numId w:val="2"/>
+        </w:numPr>
+        <w:spacing w:after="90"/>
+      </w:pPr>
+      <w:r>
+        <w:rPr>
+          <w:b/>
+          <w:bCs/>
+          <w:color w:val="1A1440"/>
+        </w:rPr>
+        <w:t xml:space="preserve">Printed &amp; posted.  </w:t>
+      </w:r>
+      <w:r>
+        <w:rPr>
+          <w:color w:val="3A3552"/>
+        </w:rPr>
+        <w:t xml:space="preserve">Mark the run printed, then posted — so you always know what has physically gone out, and when.</w:t>
+      </w:r>
+    </w:p>
+    <w:p>
+      <w:pPr>
+        <w:pStyle w:val="Heading1"/>
+        <w:spacing w:after="130" w:before="320"/>
+      </w:pPr>
+      <w:r>
+        <w:rPr>
+          <w:b/>
+          <w:bCs/>
+          <w:color w:val="7C3AED"/>
+        </w:rPr>
+        <w:t xml:space="preserve">08  </w:t>
+      </w:r>
+      <w:r>
+        <w:rPr>
+          <w:b/>
+          <w:bCs/>
+          <w:color w:val="1A1440"/>
+        </w:rPr>
+        <w:t xml:space="preserve">Outbound — recipient portal</w:t>
+      </w:r>
+    </w:p>
+    <w:p>
+      <w:pPr>
+        <w:spacing w:after="130"/>
+      </w:pPr>
+      <w:r>
+        <w:rPr>
+          <w:color w:val="3A3552"/>
+        </w:rPr>
+        <w:t xml:space="preserve">Recipients reached by email or SMS get a link to their own secure page — like an insurer sending your policy documents to a portal. They view and download what you sent, then upload their response — and any supporting documents — together in one go. Think of a job applicant returning the completed form with their passport photo, driving licence and certificates.</w:t>
+      </w:r>
+    </w:p>
+    <w:p>
+      <w:pPr>
+        <w:spacing w:after="90" w:before="180"/>
+      </w:pPr>
+      <w:r>
+        <w:rPr>
+          <w:b/>
+          <w:bCs/>
+          <w:color w:val="1A1440"/>
+          <w:sz w:val="24"/>
+          <w:szCs w:val="24"/>
+        </w:rPr>
+        <w:t xml:space="preserve">How it works</w:t>
+      </w:r>
+    </w:p>
+    <w:p>
+      <w:pPr>
+        <w:pStyle w:val="ListParagraph"/>
+        <w:numPr>
+          <w:ilvl w:val="0"/>
+          <w:numId w:val="2"/>
+        </w:numPr>
+        <w:spacing w:after="90"/>
+      </w:pPr>
+      <w:r>
+        <w:rPr>
+          <w:b/>
+          <w:bCs/>
+          <w:color w:val="1A1440"/>
+        </w:rPr>
+        <w:t xml:space="preserve">Secure, per-recipient link.  </w:t>
+      </w:r>
+      <w:r>
+        <w:rPr>
+          <w:color w:val="3A3552"/>
+        </w:rPr>
+        <w:t xml:space="preserve">A unique unguessable link — no login, no personal data in the address. When they opened and downloaded is recorded on the audit trail.</w:t>
+      </w:r>
+    </w:p>
+    <w:p>
+      <w:pPr>
+        <w:pStyle w:val="ListParagraph"/>
+        <w:numPr>
+          <w:ilvl w:val="0"/>
+          <w:numId w:val="2"/>
+        </w:numPr>
+        <w:spacing w:after="90"/>
+      </w:pPr>
+      <w:r>
+        <w:rPr>
+          <w:b/>
+          <w:bCs/>
+          <w:color w:val="1A1440"/>
+        </w:rPr>
+        <w:t xml:space="preserve">Multiple documents, one go.  </w:t>
+      </w:r>
+      <w:r>
+        <w:rPr>
+          <w:color w:val="3A3552"/>
+        </w:rPr>
+        <w:t xml:space="preserve">The completed form plus supporting documents — photo, licence, certificates — uploaded together (up to 10 files); everything is stored against their record and marks them as responded.</w:t>
+      </w:r>
+    </w:p>
+    <w:p>
+      <w:pPr>
+        <w:pStyle w:val="ListParagraph"/>
+        <w:numPr>
+          <w:ilvl w:val="0"/>
+          <w:numId w:val="2"/>
+        </w:numPr>
+        <w:spacing w:after="90"/>
+      </w:pPr>
+      <w:r>
+        <w:rPr>
+          <w:b/>
+          <w:bCs/>
+          <w:color w:val="1A1440"/>
+        </w:rPr>
+        <w:t xml:space="preserve">Sent by SMS or email.  </w:t>
+      </w:r>
+      <w:r>
+        <w:rPr>
+          <w:color w:val="3A3552"/>
+        </w:rPr>
+        <w:t xml:space="preserve">The same portal is reached from a texted link or an email button — whichever channel the recipient prefers — and the sender sees every returned file on the campaign dashboard.</w:t>
+      </w:r>
+    </w:p>
+    <w:p>
+      <w:pPr>
+        <w:pStyle w:val="Heading1"/>
+        <w:spacing w:after="130" w:before="320"/>
+      </w:pPr>
+      <w:r>
+        <w:rPr>
+          <w:b/>
+          <w:bCs/>
+          <w:color w:val="7C3AED"/>
+        </w:rPr>
+        <w:t xml:space="preserve">09  </w:t>
       </w:r>
       <w:r>
         <w:rPr>
@@ -888,7 +1248,7 @@
           <w:bCs/>
           <w:color w:val="7C3AED"/>
         </w:rPr>
-        <w:t xml:space="preserve">07  </w:t>
+        <w:t xml:space="preserve">10  </w:t>
       </w:r>
       <w:r>
         <w:rPr>

</xml_diff>